<commit_message>
Add UTM logo and full author identity to report cover
Logo Universitas Teknologi Mataram, nama lengkap RIZKI ANSORI,
NIM 24TI051, dan dosen pengampu Selamet Riadi, M.Kom.
</commit_message>
<xml_diff>
--- a/laporan/Laporan-ExpenseTracker.docx
+++ b/laporan/Laporan-ExpenseTracker.docx
@@ -4,64 +4,20 @@
   <w:body>
     <w:p>
       <w:pPr>
-        <w:spacing w:before="2200"/>
+        <w:spacing w:before="500"/>
       </w:pPr>
     </w:p>
     <w:p>
       <w:pPr>
-        <w:spacing w:after="120"/>
-        <w:jc w:val="center"/>
-      </w:pPr>
-      <w:r>
-        <w:rPr>
-          <w:b/>
-          <w:bCs/>
-          <w:sz w:val="40"/>
-          <w:szCs w:val="40"/>
-        </w:rPr>
-        <w:t xml:space="preserve">LAPORAN SINGKAT TUGAS PROYEK</w:t>
-      </w:r>
-    </w:p>
-    <w:p>
-      <w:pPr>
-        <w:spacing w:after="80"/>
-        <w:jc w:val="center"/>
-      </w:pPr>
-      <w:r>
-        <w:rPr>
-          <w:sz w:val="28"/>
-          <w:szCs w:val="28"/>
-        </w:rPr>
-        <w:t xml:space="preserve">Aplikasi Pencatatan Pengeluaran Harian</w:t>
-      </w:r>
-    </w:p>
-    <w:p>
-      <w:pPr>
-        <w:spacing w:after="400"/>
-        <w:jc w:val="center"/>
-      </w:pPr>
-      <w:r>
-        <w:rPr>
-          <w:b/>
-          <w:bCs/>
-          <w:color w:val="7C3AED"/>
-          <w:sz w:val="30"/>
-          <w:szCs w:val="30"/>
-        </w:rPr>
-        <w:t xml:space="preserve">"Duit Kemana Aja?" — Web &amp; Android</w:t>
-      </w:r>
-    </w:p>
-    <w:p>
-      <w:pPr>
-        <w:spacing w:after="500"/>
+        <w:spacing w:after="200"/>
         <w:jc w:val="center"/>
       </w:pPr>
       <w:r>
         <w:drawing>
           <wp:inline distT="0" distB="0" distL="0" distR="0">
-            <wp:extent cx="4191000" cy="2943225"/>
+            <wp:extent cx="1428750" cy="1428750"/>
             <wp:effectExtent t="0" r="0" b="0" l="0"/>
-            <wp:docPr id="1" name="cover" descr="Dashboard aplikasi" title="Dashboard"/>
+            <wp:docPr id="1" name="logo_utm" descr="Logo Universitas Teknologi Mataram" title="Logo UTM"/>
             <wp:cNvGraphicFramePr>
               <a:graphicFrameLocks xmlns:a="http://schemas.openxmlformats.org/drawingml/2006/main" noChangeAspect="1"/>
             </wp:cNvGraphicFramePr>
@@ -84,7 +40,97 @@
                   <pic:spPr bwMode="auto">
                     <a:xfrm>
                       <a:off x="0" y="0"/>
-                      <a:ext cx="4191000" cy="2943225"/>
+                      <a:ext cx="1428750" cy="1428750"/>
+                    </a:xfrm>
+                    <a:prstGeom prst="rect">
+                      <a:avLst/>
+                    </a:prstGeom>
+                  </pic:spPr>
+                </pic:pic>
+              </a:graphicData>
+            </a:graphic>
+          </wp:inline>
+        </w:drawing>
+      </w:r>
+    </w:p>
+    <w:p>
+      <w:pPr>
+        <w:spacing w:after="120"/>
+        <w:jc w:val="center"/>
+      </w:pPr>
+      <w:r>
+        <w:rPr>
+          <w:b/>
+          <w:bCs/>
+          <w:sz w:val="36"/>
+          <w:szCs w:val="36"/>
+        </w:rPr>
+        <w:t xml:space="preserve">LAPORAN SINGKAT TUGAS PROYEK</w:t>
+      </w:r>
+    </w:p>
+    <w:p>
+      <w:pPr>
+        <w:spacing w:after="80"/>
+        <w:jc w:val="center"/>
+      </w:pPr>
+      <w:r>
+        <w:rPr>
+          <w:sz w:val="26"/>
+          <w:szCs w:val="26"/>
+        </w:rPr>
+        <w:t xml:space="preserve">Aplikasi Pencatatan Pengeluaran Harian</w:t>
+      </w:r>
+    </w:p>
+    <w:p>
+      <w:pPr>
+        <w:spacing w:after="320"/>
+        <w:jc w:val="center"/>
+      </w:pPr>
+      <w:r>
+        <w:rPr>
+          <w:b/>
+          <w:bCs/>
+          <w:color w:val="7C3AED"/>
+          <w:sz w:val="28"/>
+          <w:szCs w:val="28"/>
+        </w:rPr>
+        <w:t xml:space="preserve">"Duit Kemana Aja?" — Web &amp; Android</w:t>
+      </w:r>
+    </w:p>
+    <w:p>
+      <w:pPr>
+        <w:spacing w:after="300"/>
+        <w:jc w:val="center"/>
+      </w:pPr>
+      <w:r>
+        <w:drawing>
+          <wp:inline distT="0" distB="0" distL="0" distR="0">
+            <wp:extent cx="3619500" cy="2543175"/>
+            <wp:effectExtent t="0" r="0" b="0" l="0"/>
+            <wp:docPr id="1" name="cover" descr="Dashboard aplikasi" title="Dashboard"/>
+            <wp:cNvGraphicFramePr>
+              <a:graphicFrameLocks xmlns:a="http://schemas.openxmlformats.org/drawingml/2006/main" noChangeAspect="1"/>
+            </wp:cNvGraphicFramePr>
+            <a:graphic xmlns:a="http://schemas.openxmlformats.org/drawingml/2006/main">
+              <a:graphicData uri="http://schemas.openxmlformats.org/drawingml/2006/picture">
+                <pic:pic xmlns:pic="http://schemas.openxmlformats.org/drawingml/2006/picture">
+                  <pic:nvPicPr>
+                    <pic:cNvPr id="0" name="" descr=""/>
+                    <pic:cNvPicPr>
+                      <a:picLocks noChangeAspect="1" noChangeArrowheads="1"/>
+                    </pic:cNvPicPr>
+                  </pic:nvPicPr>
+                  <pic:blipFill>
+                    <a:blip r:embed="rId9" cstate="none"/>
+                    <a:srcRect/>
+                    <a:stretch>
+                      <a:fillRect/>
+                    </a:stretch>
+                  </pic:blipFill>
+                  <pic:spPr bwMode="auto">
+                    <a:xfrm>
+                      <a:off x="0" y="0"/>
+                      <a:ext cx="3619500" cy="2543175"/>
                     </a:xfrm>
                     <a:prstGeom prst="rect">
                       <a:avLst/>
@@ -112,22 +158,22 @@
     </w:p>
     <w:p>
       <w:pPr>
-        <w:spacing w:after="60"/>
+        <w:spacing w:after="40"/>
         <w:jc w:val="center"/>
       </w:pPr>
       <w:r>
         <w:rPr>
           <w:b/>
           <w:bCs/>
-          <w:sz w:val="26"/>
-          <w:szCs w:val="26"/>
+          <w:sz w:val="28"/>
+          <w:szCs w:val="28"/>
         </w:rPr>
-        <w:t xml:space="preserve">Rizki Ansori</w:t>
+        <w:t xml:space="preserve">RIZKI ANSORI</w:t>
       </w:r>
     </w:p>
     <w:p>
       <w:pPr>
-        <w:spacing w:after="400"/>
+        <w:spacing w:after="120"/>
         <w:jc w:val="center"/>
       </w:pPr>
       <w:r>
@@ -135,7 +181,63 @@
           <w:sz w:val="22"/>
           <w:szCs w:val="22"/>
         </w:rPr>
-        <w:t xml:space="preserve">Teknik Informatika — Universitas Teknologi Mataram</w:t>
+        <w:t xml:space="preserve">NIM: 24TI051</w:t>
+      </w:r>
+    </w:p>
+    <w:p>
+      <w:pPr>
+        <w:spacing w:after="40"/>
+        <w:jc w:val="center"/>
+      </w:pPr>
+      <w:r>
+        <w:rPr>
+          <w:sz w:val="22"/>
+          <w:szCs w:val="22"/>
+        </w:rPr>
+        <w:t xml:space="preserve">Dosen Pengampu:</w:t>
+      </w:r>
+    </w:p>
+    <w:p>
+      <w:pPr>
+        <w:spacing w:after="200"/>
+        <w:jc w:val="center"/>
+      </w:pPr>
+      <w:r>
+        <w:rPr>
+          <w:b/>
+          <w:bCs/>
+          <w:sz w:val="22"/>
+          <w:szCs w:val="22"/>
+        </w:rPr>
+        <w:t xml:space="preserve">Selamet Riadi, M.Kom</w:t>
+      </w:r>
+    </w:p>
+    <w:p>
+      <w:pPr>
+        <w:spacing w:after="40"/>
+        <w:jc w:val="center"/>
+      </w:pPr>
+      <w:r>
+        <w:rPr>
+          <w:sz w:val="22"/>
+          <w:szCs w:val="22"/>
+        </w:rPr>
+        <w:t xml:space="preserve">Program Studi Teknik Informatika</w:t>
+      </w:r>
+    </w:p>
+    <w:p>
+      <w:pPr>
+        <w:spacing w:after="40"/>
+        <w:jc w:val="center"/>
+      </w:pPr>
+      <w:r>
+        <w:rPr>
+          <w:b/>
+          <w:bCs/>
+          <w:sz w:val="22"/>
+          <w:szCs w:val="22"/>
+        </w:rPr>
+        <w:t xml:space="preserve">Universitas Teknologi Mataram</w:t>
       </w:r>
     </w:p>
     <w:p>
@@ -146,8 +248,8 @@
         <w:rPr>
           <w:b/>
           <w:bCs/>
-          <w:sz w:val="24"/>
-          <w:szCs w:val="24"/>
+          <w:sz w:val="22"/>
+          <w:szCs w:val="22"/>
         </w:rPr>
         <w:t xml:space="preserve">2026</w:t>
       </w:r>
@@ -447,7 +549,7 @@
                     </pic:cNvPicPr>
                   </pic:nvPicPr>
                   <pic:blipFill>
-                    <a:blip r:embed="rId8" cstate="none"/>
+                    <a:blip r:embed="rId9" cstate="none"/>
                     <a:srcRect/>
                     <a:stretch>
                       <a:fillRect/>
@@ -510,7 +612,7 @@
                     </pic:cNvPicPr>
                   </pic:nvPicPr>
                   <pic:blipFill>
-                    <a:blip r:embed="rId9" cstate="none"/>
+                    <a:blip r:embed="rId10" cstate="none"/>
                     <a:srcRect/>
                     <a:stretch>
                       <a:fillRect/>
@@ -573,7 +675,7 @@
                     </pic:cNvPicPr>
                   </pic:nvPicPr>
                   <pic:blipFill>
-                    <a:blip r:embed="rId10" cstate="none"/>
+                    <a:blip r:embed="rId11" cstate="none"/>
                     <a:srcRect/>
                     <a:stretch>
                       <a:fillRect/>
@@ -669,7 +771,7 @@
                           </pic:cNvPicPr>
                         </pic:nvPicPr>
                         <pic:blipFill>
-                          <a:blip r:embed="rId11" cstate="none"/>
+                          <a:blip r:embed="rId12" cstate="none"/>
                           <a:srcRect/>
                           <a:stretch>
                             <a:fillRect/>
@@ -748,7 +850,7 @@
                           </pic:cNvPicPr>
                         </pic:nvPicPr>
                         <pic:blipFill>
-                          <a:blip r:embed="rId12" cstate="none"/>
+                          <a:blip r:embed="rId13" cstate="none"/>
                           <a:srcRect/>
                           <a:stretch>
                             <a:fillRect/>

</xml_diff>